<commit_message>
completed glosary & added non functional requirements
</commit_message>
<xml_diff>
--- a/docs/1_requerimientos/Casos De Uso.docx
+++ b/docs/1_requerimientos/Casos De Uso.docx
@@ -274,31 +274,547 @@
     </w:p>
     <w:p>
       <w:pPr>
+        <w:pStyle w:val="878"/>
         <w:numPr>
           <w:ilvl w:val="0"/>
-          <w:numId w:val="11"/>
+          <w:numId w:val="14"/>
         </w:numPr>
-        <w:pBdr/>
-        <w:spacing/>
-        <w:ind w:hanging="360" w:left="720"/>
+        <w:pBdr>
+          <w:top w:val="none" w:color="000000" w:sz="4" w:space="0"/>
+          <w:left w:val="none" w:color="000000" w:sz="4" w:space="0"/>
+          <w:bottom w:val="none" w:color="000000" w:sz="4" w:space="0"/>
+          <w:right w:val="none" w:color="000000" w:sz="4" w:space="0"/>
+        </w:pBdr>
+        <w:spacing w:after="200" w:before="0" w:line="331" w:lineRule="auto"/>
+        <w:ind w:right="0"/>
         <w:rPr/>
-        <w:sectPr>
-          <w:footnotePr/>
-          <w:endnotePr/>
-          <w:type w:val="nextPage"/>
-          <w:pgSz w:h="16838" w:orient="portrait" w:w="11906"/>
-          <w:pgMar w:top="1440" w:right="1440" w:bottom="1440" w:left="1440" w:header="720" w:footer="720" w:gutter="0"/>
-          <w:pgNumType w:start="1"/>
-          <w:cols w:num="1" w:sep="0" w:space="1701" w:equalWidth="1"/>
-        </w:sectPr>
-      </w:pPr>
+      </w:pPr>
+      <w:r>
+        <w:rPr>
+          <w:rFonts w:ascii="Inter" w:hAnsi="Inter" w:eastAsia="Inter" w:cs="Inter"/>
+          <w:color w:val="000000"/>
+          <w:sz w:val="24"/>
+          <w:u w:val="none"/>
+        </w:rPr>
+        <w:t xml:space="preserve">Administrador: Usuario con poder para gestionar la plataforma, moderar contenido y suspender cuentas.</w:t>
+      </w:r>
+      <w:r/>
+    </w:p>
+    <w:p>
+      <w:pPr>
+        <w:pStyle w:val="878"/>
+        <w:numPr>
+          <w:ilvl w:val="0"/>
+          <w:numId w:val="14"/>
+        </w:numPr>
+        <w:pBdr>
+          <w:top w:val="none" w:color="000000" w:sz="4" w:space="0"/>
+          <w:left w:val="none" w:color="000000" w:sz="4" w:space="0"/>
+          <w:bottom w:val="none" w:color="000000" w:sz="4" w:space="0"/>
+          <w:right w:val="none" w:color="000000" w:sz="4" w:space="0"/>
+        </w:pBdr>
+        <w:spacing w:after="200" w:before="0" w:line="331" w:lineRule="auto"/>
+        <w:ind w:right="0"/>
+        <w:rPr/>
+      </w:pPr>
+      <w:r>
+        <w:rPr>
+          <w:rFonts w:ascii="Inter" w:hAnsi="Inter" w:eastAsia="Inter" w:cs="Inter"/>
+          <w:color w:val="000000"/>
+          <w:sz w:val="24"/>
+          <w:u w:val="none"/>
+        </w:rPr>
+        <w:t xml:space="preserve">Álbum: Carpeta virtual de fotos donde el creador elige qué amigos pueden verlas o comentarlas.</w:t>
+      </w:r>
+      <w:r/>
+    </w:p>
+    <w:p>
+      <w:pPr>
+        <w:pStyle w:val="878"/>
+        <w:numPr>
+          <w:ilvl w:val="0"/>
+          <w:numId w:val="14"/>
+        </w:numPr>
+        <w:pBdr>
+          <w:top w:val="none" w:color="000000" w:sz="4" w:space="0"/>
+          <w:left w:val="none" w:color="000000" w:sz="4" w:space="0"/>
+          <w:bottom w:val="none" w:color="000000" w:sz="4" w:space="0"/>
+          <w:right w:val="none" w:color="000000" w:sz="4" w:space="0"/>
+        </w:pBdr>
+        <w:spacing w:after="200" w:before="0" w:line="331" w:lineRule="auto"/>
+        <w:ind w:right="0"/>
+        <w:rPr/>
+      </w:pPr>
+      <w:r>
+        <w:rPr>
+          <w:rFonts w:ascii="Inter" w:hAnsi="Inter" w:eastAsia="Inter" w:cs="Inter"/>
+          <w:color w:val="000000"/>
+          <w:sz w:val="24"/>
+          <w:u w:val="none"/>
+        </w:rPr>
+        <w:t xml:space="preserve">Amigo / Lista de amigos: Conexión mutua entre dos usuarios que les permite ver sus perfiles e interactuar.</w:t>
+      </w:r>
+      <w:r/>
+    </w:p>
+    <w:p>
+      <w:pPr>
+        <w:pStyle w:val="878"/>
+        <w:numPr>
+          <w:ilvl w:val="0"/>
+          <w:numId w:val="14"/>
+        </w:numPr>
+        <w:pBdr>
+          <w:top w:val="none" w:color="000000" w:sz="4" w:space="0"/>
+          <w:left w:val="none" w:color="000000" w:sz="4" w:space="0"/>
+          <w:bottom w:val="none" w:color="000000" w:sz="4" w:space="0"/>
+          <w:right w:val="none" w:color="000000" w:sz="4" w:space="0"/>
+        </w:pBdr>
+        <w:spacing w:after="200" w:before="0" w:line="331" w:lineRule="auto"/>
+        <w:ind w:right="0"/>
+        <w:rPr/>
+      </w:pPr>
+      <w:r>
+        <w:rPr>
+          <w:rFonts w:ascii="Inter" w:hAnsi="Inter" w:eastAsia="Inter" w:cs="Inter"/>
+          <w:color w:val="000000"/>
+          <w:sz w:val="24"/>
+          <w:u w:val="none"/>
+        </w:rPr>
+        <w:t xml:space="preserve">Amigos en común: Contactos que dos usuarios tienen de forma compartida.</w:t>
+      </w:r>
+      <w:r/>
+    </w:p>
+    <w:p>
+      <w:pPr>
+        <w:pStyle w:val="878"/>
+        <w:numPr>
+          <w:ilvl w:val="0"/>
+          <w:numId w:val="14"/>
+        </w:numPr>
+        <w:pBdr>
+          <w:top w:val="none" w:color="000000" w:sz="4" w:space="0"/>
+          <w:left w:val="none" w:color="000000" w:sz="4" w:space="0"/>
+          <w:bottom w:val="none" w:color="000000" w:sz="4" w:space="0"/>
+          <w:right w:val="none" w:color="000000" w:sz="4" w:space="0"/>
+        </w:pBdr>
+        <w:spacing w:after="200" w:before="0" w:line="331" w:lineRule="auto"/>
+        <w:ind w:right="0"/>
+        <w:rPr/>
+      </w:pPr>
+      <w:r>
+        <w:rPr>
+          <w:rFonts w:ascii="Inter" w:hAnsi="Inter" w:eastAsia="Inter" w:cs="Inter"/>
+          <w:color w:val="000000"/>
+          <w:sz w:val="24"/>
+          <w:u w:val="none"/>
+        </w:rPr>
+        <w:t xml:space="preserve">Borrado en cascada: Acción donde borrar un contenedor principal (como un álbum) elimina automáticamente todo lo que tiene dentro (las fotos).</w:t>
+      </w:r>
+      <w:r/>
+    </w:p>
+    <w:p>
+      <w:pPr>
+        <w:pStyle w:val="878"/>
+        <w:numPr>
+          <w:ilvl w:val="0"/>
+          <w:numId w:val="14"/>
+        </w:numPr>
+        <w:pBdr>
+          <w:top w:val="none" w:color="000000" w:sz="4" w:space="0"/>
+          <w:left w:val="none" w:color="000000" w:sz="4" w:space="0"/>
+          <w:bottom w:val="none" w:color="000000" w:sz="4" w:space="0"/>
+          <w:right w:val="none" w:color="000000" w:sz="4" w:space="0"/>
+        </w:pBdr>
+        <w:spacing w:after="200" w:before="0" w:line="331" w:lineRule="auto"/>
+        <w:ind w:right="0"/>
+        <w:rPr/>
+      </w:pPr>
+      <w:r>
+        <w:rPr>
+          <w:rFonts w:ascii="Inter" w:hAnsi="Inter" w:eastAsia="Inter" w:cs="Inter"/>
+          <w:color w:val="000000"/>
+          <w:sz w:val="24"/>
+          <w:u w:val="none"/>
+        </w:rPr>
+        <w:t xml:space="preserve">Chat / Mensajería: Espacio para enviar mensajes de texto y multimedia a nivel individual o grupal.</w:t>
+      </w:r>
+      <w:r/>
+    </w:p>
+    <w:p>
+      <w:pPr>
+        <w:pStyle w:val="878"/>
+        <w:numPr>
+          <w:ilvl w:val="0"/>
+          <w:numId w:val="14"/>
+        </w:numPr>
+        <w:pBdr>
+          <w:top w:val="none" w:color="000000" w:sz="4" w:space="0"/>
+          <w:left w:val="none" w:color="000000" w:sz="4" w:space="0"/>
+          <w:bottom w:val="none" w:color="000000" w:sz="4" w:space="0"/>
+          <w:right w:val="none" w:color="000000" w:sz="4" w:space="0"/>
+        </w:pBdr>
+        <w:spacing w:after="200" w:before="0" w:line="331" w:lineRule="auto"/>
+        <w:ind w:right="0"/>
+        <w:rPr/>
+      </w:pPr>
+      <w:r>
+        <w:rPr>
+          <w:rFonts w:ascii="Inter" w:hAnsi="Inter" w:eastAsia="Inter" w:cs="Inter"/>
+          <w:color w:val="000000"/>
+          <w:sz w:val="24"/>
+          <w:u w:val="none"/>
+        </w:rPr>
+        <w:t xml:space="preserve">Comentario: Texto breve que un usuario publica en un muro o en una foto.</w:t>
+      </w:r>
+      <w:r/>
+    </w:p>
+    <w:p>
+      <w:pPr>
+        <w:pStyle w:val="878"/>
+        <w:numPr>
+          <w:ilvl w:val="0"/>
+          <w:numId w:val="14"/>
+        </w:numPr>
+        <w:pBdr>
+          <w:top w:val="none" w:color="000000" w:sz="4" w:space="0"/>
+          <w:left w:val="none" w:color="000000" w:sz="4" w:space="0"/>
+          <w:bottom w:val="none" w:color="000000" w:sz="4" w:space="0"/>
+          <w:right w:val="none" w:color="000000" w:sz="4" w:space="0"/>
+        </w:pBdr>
+        <w:spacing w:after="200" w:before="0" w:line="331" w:lineRule="auto"/>
+        <w:ind w:right="0"/>
+        <w:rPr/>
+      </w:pPr>
+      <w:r>
+        <w:rPr>
+          <w:rFonts w:ascii="Inter" w:hAnsi="Inter" w:eastAsia="Inter" w:cs="Inter"/>
+          <w:color w:val="000000"/>
+          <w:sz w:val="24"/>
+          <w:u w:val="none"/>
+        </w:rPr>
+        <w:t xml:space="preserve">Credenciales: El correo electrónico y la contraseña necesarios para iniciar sesión.</w:t>
+      </w:r>
+      <w:r/>
+    </w:p>
+    <w:p>
+      <w:pPr>
+        <w:pStyle w:val="878"/>
+        <w:numPr>
+          <w:ilvl w:val="0"/>
+          <w:numId w:val="14"/>
+        </w:numPr>
+        <w:pBdr>
+          <w:top w:val="none" w:color="000000" w:sz="4" w:space="0"/>
+          <w:left w:val="none" w:color="000000" w:sz="4" w:space="0"/>
+          <w:bottom w:val="none" w:color="000000" w:sz="4" w:space="0"/>
+          <w:right w:val="none" w:color="000000" w:sz="4" w:space="0"/>
+        </w:pBdr>
+        <w:spacing w:after="200" w:before="0" w:line="331" w:lineRule="auto"/>
+        <w:ind w:right="0"/>
+        <w:rPr/>
+      </w:pPr>
+      <w:r>
+        <w:rPr>
+          <w:rFonts w:ascii="Inter" w:hAnsi="Inter" w:eastAsia="Inter" w:cs="Inter"/>
+          <w:color w:val="000000"/>
+          <w:sz w:val="24"/>
+          <w:u w:val="none"/>
+        </w:rPr>
+        <w:t xml:space="preserve">Deshabilitar Usuario: Bloqueo de cuenta realizado por un administrador para impedir que un usuario use la plataforma.</w:t>
+      </w:r>
+      <w:r/>
+    </w:p>
+    <w:p>
+      <w:pPr>
+        <w:pStyle w:val="878"/>
+        <w:numPr>
+          <w:ilvl w:val="0"/>
+          <w:numId w:val="14"/>
+        </w:numPr>
+        <w:pBdr>
+          <w:top w:val="none" w:color="000000" w:sz="4" w:space="0"/>
+          <w:left w:val="none" w:color="000000" w:sz="4" w:space="0"/>
+          <w:bottom w:val="none" w:color="000000" w:sz="4" w:space="0"/>
+          <w:right w:val="none" w:color="000000" w:sz="4" w:space="0"/>
+        </w:pBdr>
+        <w:spacing w:after="200" w:before="0" w:line="331" w:lineRule="auto"/>
+        <w:ind w:right="0"/>
+        <w:rPr/>
+      </w:pPr>
+      <w:r>
+        <w:rPr>
+          <w:rFonts w:ascii="Inter" w:hAnsi="Inter" w:eastAsia="Inter" w:cs="Inter"/>
+          <w:color w:val="000000"/>
+          <w:sz w:val="24"/>
+          <w:u w:val="none"/>
+        </w:rPr>
+        <w:t xml:space="preserve">Direct Message (DM): Chat privado y directo entre dos amigos.</w:t>
+      </w:r>
+      <w:r/>
+    </w:p>
+    <w:p>
+      <w:pPr>
+        <w:pStyle w:val="878"/>
+        <w:numPr>
+          <w:ilvl w:val="0"/>
+          <w:numId w:val="14"/>
+        </w:numPr>
+        <w:pBdr>
+          <w:top w:val="none" w:color="000000" w:sz="4" w:space="0"/>
+          <w:left w:val="none" w:color="000000" w:sz="4" w:space="0"/>
+          <w:bottom w:val="none" w:color="000000" w:sz="4" w:space="0"/>
+          <w:right w:val="none" w:color="000000" w:sz="4" w:space="0"/>
+        </w:pBdr>
+        <w:spacing w:after="200" w:before="0" w:line="331" w:lineRule="auto"/>
+        <w:ind w:right="0"/>
+        <w:rPr/>
+      </w:pPr>
+      <w:r>
+        <w:rPr>
+          <w:rFonts w:ascii="Inter" w:hAnsi="Inter" w:eastAsia="Inter" w:cs="Inter"/>
+          <w:color w:val="000000"/>
+          <w:sz w:val="24"/>
+          <w:u w:val="none"/>
+        </w:rPr>
+        <w:t xml:space="preserve">Foto: Imagen subida a un álbum que adopta la misma privacidad de esa carpeta y puede incluir una descripción.</w:t>
+      </w:r>
+      <w:r/>
+    </w:p>
+    <w:p>
+      <w:pPr>
+        <w:pStyle w:val="878"/>
+        <w:numPr>
+          <w:ilvl w:val="0"/>
+          <w:numId w:val="14"/>
+        </w:numPr>
+        <w:pBdr>
+          <w:top w:val="none" w:color="000000" w:sz="4" w:space="0"/>
+          <w:left w:val="none" w:color="000000" w:sz="4" w:space="0"/>
+          <w:bottom w:val="none" w:color="000000" w:sz="4" w:space="0"/>
+          <w:right w:val="none" w:color="000000" w:sz="4" w:space="0"/>
+        </w:pBdr>
+        <w:spacing w:after="200" w:before="0" w:line="331" w:lineRule="auto"/>
+        <w:ind w:right="0"/>
+        <w:rPr/>
+      </w:pPr>
+      <w:r>
+        <w:rPr>
+          <w:rFonts w:ascii="Inter" w:hAnsi="Inter" w:eastAsia="Inter" w:cs="Inter"/>
+          <w:color w:val="000000"/>
+          <w:sz w:val="24"/>
+          <w:u w:val="none"/>
+        </w:rPr>
+        <w:t xml:space="preserve">Grupo de amigos: Etiquetas (como "Familia") para organizar contactos y controlar la privacidad de forma masiva.</w:t>
+      </w:r>
+      <w:r/>
+    </w:p>
+    <w:p>
+      <w:pPr>
+        <w:pStyle w:val="878"/>
+        <w:numPr>
+          <w:ilvl w:val="0"/>
+          <w:numId w:val="14"/>
+        </w:numPr>
+        <w:pBdr>
+          <w:top w:val="none" w:color="000000" w:sz="4" w:space="0"/>
+          <w:left w:val="none" w:color="000000" w:sz="4" w:space="0"/>
+          <w:bottom w:val="none" w:color="000000" w:sz="4" w:space="0"/>
+          <w:right w:val="none" w:color="000000" w:sz="4" w:space="0"/>
+        </w:pBdr>
+        <w:spacing w:after="200" w:before="0" w:line="331" w:lineRule="auto"/>
+        <w:ind w:right="0"/>
+        <w:rPr/>
+      </w:pPr>
+      <w:r>
+        <w:rPr>
+          <w:rFonts w:ascii="Inter" w:hAnsi="Inter" w:eastAsia="Inter" w:cs="Inter"/>
+          <w:color w:val="000000"/>
+          <w:sz w:val="24"/>
+          <w:u w:val="none"/>
+        </w:rPr>
+        <w:t xml:space="preserve">Grupo (de mensajería): Chat de varias personas con nombre, foto propia y diferentes niveles de permisos.</w:t>
+      </w:r>
+      <w:r/>
+    </w:p>
+    <w:p>
+      <w:pPr>
+        <w:pStyle w:val="878"/>
+        <w:numPr>
+          <w:ilvl w:val="0"/>
+          <w:numId w:val="14"/>
+        </w:numPr>
+        <w:pBdr>
+          <w:top w:val="none" w:color="000000" w:sz="4" w:space="0"/>
+          <w:left w:val="none" w:color="000000" w:sz="4" w:space="0"/>
+          <w:bottom w:val="none" w:color="000000" w:sz="4" w:space="0"/>
+          <w:right w:val="none" w:color="000000" w:sz="4" w:space="0"/>
+        </w:pBdr>
+        <w:spacing w:after="200" w:before="0" w:line="331" w:lineRule="auto"/>
+        <w:ind w:right="0"/>
+        <w:rPr/>
+      </w:pPr>
+      <w:r>
+        <w:rPr>
+          <w:rFonts w:ascii="Inter" w:hAnsi="Inter" w:eastAsia="Inter" w:cs="Inter"/>
+          <w:color w:val="000000"/>
+          <w:sz w:val="24"/>
+          <w:u w:val="none"/>
+        </w:rPr>
+        <w:t xml:space="preserve">Muro: Sección del perfil donde se muestran fotos destacadas y los comentarios de los amigos.</w:t>
+      </w:r>
+      <w:r/>
+    </w:p>
+    <w:p>
+      <w:pPr>
+        <w:pStyle w:val="878"/>
+        <w:numPr>
+          <w:ilvl w:val="0"/>
+          <w:numId w:val="14"/>
+        </w:numPr>
+        <w:pBdr>
+          <w:top w:val="none" w:color="000000" w:sz="4" w:space="0"/>
+          <w:left w:val="none" w:color="000000" w:sz="4" w:space="0"/>
+          <w:bottom w:val="none" w:color="000000" w:sz="4" w:space="0"/>
+          <w:right w:val="none" w:color="000000" w:sz="4" w:space="0"/>
+        </w:pBdr>
+        <w:spacing w:after="200" w:before="0" w:line="331" w:lineRule="auto"/>
+        <w:ind w:right="0"/>
+        <w:rPr/>
+      </w:pPr>
+      <w:r>
+        <w:rPr>
+          <w:rFonts w:ascii="Inter" w:hAnsi="Inter" w:eastAsia="Inter" w:cs="Inter"/>
+          <w:color w:val="000000"/>
+          <w:sz w:val="24"/>
+          <w:u w:val="none"/>
+        </w:rPr>
+        <w:t xml:space="preserve">Notificación: Aviso del sistema sobre novedades como solicitudes de amistad, cumpleaños o comentarios nuevos.</w:t>
+      </w:r>
+      <w:r/>
+    </w:p>
+    <w:p>
+      <w:pPr>
+        <w:pStyle w:val="878"/>
+        <w:numPr>
+          <w:ilvl w:val="0"/>
+          <w:numId w:val="14"/>
+        </w:numPr>
+        <w:pBdr>
+          <w:top w:val="none" w:color="000000" w:sz="4" w:space="0"/>
+          <w:left w:val="none" w:color="000000" w:sz="4" w:space="0"/>
+          <w:bottom w:val="none" w:color="000000" w:sz="4" w:space="0"/>
+          <w:right w:val="none" w:color="000000" w:sz="4" w:space="0"/>
+        </w:pBdr>
+        <w:spacing w:after="200" w:before="0" w:line="331" w:lineRule="auto"/>
+        <w:ind w:right="0"/>
+        <w:rPr/>
+      </w:pPr>
+      <w:r>
+        <w:rPr>
+          <w:rFonts w:ascii="Inter" w:hAnsi="Inter" w:eastAsia="Inter" w:cs="Inter"/>
+          <w:color w:val="000000"/>
+          <w:sz w:val="24"/>
+          <w:u w:val="none"/>
+        </w:rPr>
+        <w:t xml:space="preserve">Perfil: Espacio con los datos personales, foto y presentación de un usuario.</w:t>
+      </w:r>
+      <w:r/>
+    </w:p>
+    <w:p>
+      <w:pPr>
+        <w:pStyle w:val="878"/>
+        <w:numPr>
+          <w:ilvl w:val="0"/>
+          <w:numId w:val="14"/>
+        </w:numPr>
+        <w:pBdr>
+          <w:top w:val="none" w:color="000000" w:sz="4" w:space="0"/>
+          <w:left w:val="none" w:color="000000" w:sz="4" w:space="0"/>
+          <w:bottom w:val="none" w:color="000000" w:sz="4" w:space="0"/>
+          <w:right w:val="none" w:color="000000" w:sz="4" w:space="0"/>
+        </w:pBdr>
+        <w:spacing w:after="200" w:before="0" w:line="331" w:lineRule="auto"/>
+        <w:ind w:right="0"/>
+        <w:rPr/>
+      </w:pPr>
+      <w:r>
+        <w:rPr>
+          <w:rFonts w:ascii="Inter" w:hAnsi="Inter" w:eastAsia="Inter" w:cs="Inter"/>
+          <w:color w:val="000000"/>
+          <w:sz w:val="24"/>
+          <w:u w:val="none"/>
+        </w:rPr>
+        <w:t xml:space="preserve">Portal: Pantalla de inicio o menú principal que aparece al iniciar sesión y centraliza las novedades propias de cada usuario.</w:t>
+      </w:r>
+      <w:r/>
+    </w:p>
+    <w:p>
+      <w:pPr>
+        <w:pStyle w:val="878"/>
+        <w:numPr>
+          <w:ilvl w:val="0"/>
+          <w:numId w:val="14"/>
+        </w:numPr>
+        <w:pBdr>
+          <w:top w:val="none" w:color="000000" w:sz="4" w:space="0"/>
+          <w:left w:val="none" w:color="000000" w:sz="4" w:space="0"/>
+          <w:bottom w:val="none" w:color="000000" w:sz="4" w:space="0"/>
+          <w:right w:val="none" w:color="000000" w:sz="4" w:space="0"/>
+        </w:pBdr>
+        <w:spacing w:after="200" w:before="0" w:line="331" w:lineRule="auto"/>
+        <w:ind w:right="0"/>
+        <w:rPr/>
+      </w:pPr>
+      <w:r>
+        <w:rPr>
+          <w:rFonts w:ascii="Inter" w:hAnsi="Inter" w:eastAsia="Inter" w:cs="Inter"/>
+          <w:color w:val="000000"/>
+          <w:sz w:val="24"/>
+          <w:u w:val="none"/>
+        </w:rPr>
+        <w:t xml:space="preserve">Roles: Permisos asignados dentro de un grupo de chat, como el administrador del grupo que puede borrar miembros.</w:t>
+      </w:r>
+      <w:r/>
+    </w:p>
+    <w:p>
+      <w:pPr>
+        <w:pStyle w:val="878"/>
+        <w:numPr>
+          <w:ilvl w:val="0"/>
+          <w:numId w:val="14"/>
+        </w:numPr>
+        <w:pBdr>
+          <w:top w:val="none" w:color="000000" w:sz="4" w:space="0"/>
+          <w:left w:val="none" w:color="000000" w:sz="4" w:space="0"/>
+          <w:bottom w:val="none" w:color="000000" w:sz="4" w:space="0"/>
+          <w:right w:val="none" w:color="000000" w:sz="4" w:space="0"/>
+        </w:pBdr>
+        <w:spacing w:after="200" w:before="240" w:line="331" w:lineRule="auto"/>
+        <w:ind w:right="0"/>
+        <w:rPr/>
+      </w:pPr>
+      <w:r>
+        <w:rPr>
+          <w:rFonts w:ascii="Inter" w:hAnsi="Inter" w:eastAsia="Inter" w:cs="Inter"/>
+          <w:color w:val="000000"/>
+          <w:sz w:val="24"/>
+          <w:u w:val="none"/>
+        </w:rPr>
+        <w:t xml:space="preserve">Solicitud de amistad: Invitación para conectar con otro usuario, la cual puede ser aceptada, rechazada o quedar pendiente.</w:t>
+      </w:r>
+      <w:r/>
       <w:r>
         <w:rPr>
           <w:rtl w:val="0"/>
         </w:rPr>
-        <w:t xml:space="preserve">Portal: sección propia de cada usuario / dashboard principal.</w:t>
       </w:r>
       <w:r/>
+      <w:r>
+        <w:rPr>
+          <w:rFonts w:ascii="Inter" w:hAnsi="Inter" w:eastAsia="Inter" w:cs="Inter"/>
+          <w:sz w:val="24"/>
+        </w:rPr>
+      </w:r>
     </w:p>
     <w:p>
       <w:pPr>
@@ -2225,17 +2741,6 @@
             </w:pPr>
             <w:r>
               <w:t xml:space="preserve">2.1 Si un cliente realiza 10 intentos de iniciar sesion, no podrá volver a intentar durante 1 hora</w:t>
-            </w:r>
-            <w:r>
-              <w:rPr>
-                <w:color w:val="1f1f1f"/>
-              </w:rPr>
-            </w:r>
-            <w:r>
-              <w:rPr>
-                <w:color w:val="1f1f1f"/>
-                <w:rtl w:val="0"/>
-              </w:rPr>
             </w:r>
             <w:r>
               <w:rPr>
@@ -5829,6 +6334,153 @@
       <w:suff w:val="tab"/>
     </w:lvl>
   </w:abstractNum>
+  <w:abstractNum w:abstractNumId="13">
+    <w:nsid w:val="1C5EEB74"/>
+    <w:lvl w:ilvl="0">
+      <w:isLgl w:val="false"/>
+      <w:lvlJc w:val="left"/>
+      <w:lvlText w:val="·"/>
+      <w:numFmt w:val="bullet"/>
+      <w:pPr>
+        <w:pBdr/>
+        <w:spacing/>
+        <w:ind w:hanging="360" w:left="709"/>
+      </w:pPr>
+      <w:rPr>
+        <w:rFonts w:hint="default" w:ascii="Symbol" w:hAnsi="Symbol" w:eastAsia="Symbol" w:cs="Symbol"/>
+      </w:rPr>
+      <w:start w:val="1"/>
+      <w:suff w:val="tab"/>
+    </w:lvl>
+    <w:lvl w:ilvl="1">
+      <w:isLgl w:val="false"/>
+      <w:lvlJc w:val="left"/>
+      <w:lvlText w:val="o"/>
+      <w:numFmt w:val="bullet"/>
+      <w:pPr>
+        <w:pBdr/>
+        <w:spacing/>
+        <w:ind w:hanging="360" w:left="1429"/>
+      </w:pPr>
+      <w:rPr>
+        <w:rFonts w:hint="default" w:ascii="Courier New" w:hAnsi="Courier New" w:eastAsia="Courier New" w:cs="Courier New"/>
+      </w:rPr>
+      <w:start w:val="1"/>
+      <w:suff w:val="tab"/>
+    </w:lvl>
+    <w:lvl w:ilvl="2">
+      <w:isLgl w:val="false"/>
+      <w:lvlJc w:val="left"/>
+      <w:lvlText w:val="§"/>
+      <w:numFmt w:val="bullet"/>
+      <w:pPr>
+        <w:pBdr/>
+        <w:spacing/>
+        <w:ind w:hanging="360" w:left="2149"/>
+      </w:pPr>
+      <w:rPr>
+        <w:rFonts w:hint="default" w:ascii="Wingdings" w:hAnsi="Wingdings" w:eastAsia="Wingdings" w:cs="Wingdings"/>
+      </w:rPr>
+      <w:start w:val="1"/>
+      <w:suff w:val="tab"/>
+    </w:lvl>
+    <w:lvl w:ilvl="3">
+      <w:isLgl w:val="false"/>
+      <w:lvlJc w:val="left"/>
+      <w:lvlText w:val="·"/>
+      <w:numFmt w:val="bullet"/>
+      <w:pPr>
+        <w:pBdr/>
+        <w:spacing/>
+        <w:ind w:hanging="360" w:left="2869"/>
+      </w:pPr>
+      <w:rPr>
+        <w:rFonts w:hint="default" w:ascii="Symbol" w:hAnsi="Symbol" w:eastAsia="Symbol" w:cs="Symbol"/>
+      </w:rPr>
+      <w:start w:val="1"/>
+      <w:suff w:val="tab"/>
+    </w:lvl>
+    <w:lvl w:ilvl="4">
+      <w:isLgl w:val="false"/>
+      <w:lvlJc w:val="left"/>
+      <w:lvlText w:val="o"/>
+      <w:numFmt w:val="bullet"/>
+      <w:pPr>
+        <w:pBdr/>
+        <w:spacing/>
+        <w:ind w:hanging="360" w:left="3589"/>
+      </w:pPr>
+      <w:rPr>
+        <w:rFonts w:hint="default" w:ascii="Courier New" w:hAnsi="Courier New" w:eastAsia="Courier New" w:cs="Courier New"/>
+      </w:rPr>
+      <w:start w:val="1"/>
+      <w:suff w:val="tab"/>
+    </w:lvl>
+    <w:lvl w:ilvl="5">
+      <w:isLgl w:val="false"/>
+      <w:lvlJc w:val="left"/>
+      <w:lvlText w:val="§"/>
+      <w:numFmt w:val="bullet"/>
+      <w:pPr>
+        <w:pBdr/>
+        <w:spacing/>
+        <w:ind w:hanging="360" w:left="4309"/>
+      </w:pPr>
+      <w:rPr>
+        <w:rFonts w:hint="default" w:ascii="Wingdings" w:hAnsi="Wingdings" w:eastAsia="Wingdings" w:cs="Wingdings"/>
+      </w:rPr>
+      <w:start w:val="1"/>
+      <w:suff w:val="tab"/>
+    </w:lvl>
+    <w:lvl w:ilvl="6">
+      <w:isLgl w:val="false"/>
+      <w:lvlJc w:val="left"/>
+      <w:lvlText w:val="·"/>
+      <w:numFmt w:val="bullet"/>
+      <w:pPr>
+        <w:pBdr/>
+        <w:spacing/>
+        <w:ind w:hanging="360" w:left="5029"/>
+      </w:pPr>
+      <w:rPr>
+        <w:rFonts w:hint="default" w:ascii="Symbol" w:hAnsi="Symbol" w:eastAsia="Symbol" w:cs="Symbol"/>
+      </w:rPr>
+      <w:start w:val="1"/>
+      <w:suff w:val="tab"/>
+    </w:lvl>
+    <w:lvl w:ilvl="7">
+      <w:isLgl w:val="false"/>
+      <w:lvlJc w:val="left"/>
+      <w:lvlText w:val="o"/>
+      <w:numFmt w:val="bullet"/>
+      <w:pPr>
+        <w:pBdr/>
+        <w:spacing/>
+        <w:ind w:hanging="360" w:left="5749"/>
+      </w:pPr>
+      <w:rPr>
+        <w:rFonts w:hint="default" w:ascii="Courier New" w:hAnsi="Courier New" w:eastAsia="Courier New" w:cs="Courier New"/>
+      </w:rPr>
+      <w:start w:val="1"/>
+      <w:suff w:val="tab"/>
+    </w:lvl>
+    <w:lvl w:ilvl="8">
+      <w:isLgl w:val="false"/>
+      <w:lvlJc w:val="left"/>
+      <w:lvlText w:val="§"/>
+      <w:numFmt w:val="bullet"/>
+      <w:pPr>
+        <w:pBdr/>
+        <w:spacing/>
+        <w:ind w:hanging="360" w:left="6469"/>
+      </w:pPr>
+      <w:rPr>
+        <w:rFonts w:hint="default" w:ascii="Wingdings" w:hAnsi="Wingdings" w:eastAsia="Wingdings" w:cs="Wingdings"/>
+      </w:rPr>
+      <w:start w:val="1"/>
+      <w:suff w:val="tab"/>
+    </w:lvl>
+  </w:abstractNum>
   <w:num w:numId="1">
     <w:abstractNumId w:val="0"/>
   </w:num>
@@ -5867,6 +6519,9 @@
   </w:num>
   <w:num w:numId="13">
     <w:abstractNumId w:val="12"/>
+  </w:num>
+  <w:num w:numId="14">
+    <w:abstractNumId w:val="13"/>
   </w:num>
 </w:numbering>
 </file>

</xml_diff>